<commit_message>
Update proposal figures to revised workbook pricing (USD 354,605.55)
- Staffing: Abatis 200 man-days (TL 60, OT/ICS 60, Gov 40, IEC/C2M2 20,
  Training 20); EML 220 man-days (DPM SCADA 100, Electrical 50)
- Financial summary: base 267,425.00; profit 80,227.50; total excl.
  taxes 347,652.50; SSCL 6,953.05; grand total 354,605.55
- Replace workbook with revised version supplied by Chris

Co-Authored-By: Claude Fable 5 <noreply@anthropic.com>
Claude-Session: https://claude.ai/code/session_015ypYFL7E2g6EXFAxcDeuoe
</commit_message>
<xml_diff>
--- a/PUCSL_Technical_Proposal_Draft.docx
+++ b/PUCSL_Technical_Proposal_Draft.docx
@@ -2561,7 +2561,7 @@
           <w:sz w:val="22"/>
           <w:szCs w:val="22"/>
         </w:rPr>
-        <w:t xml:space="preserve">Abatis: 120 man-days — Team Leader (30), Senior OT/ICS Specialist (60), Governance Specialist (20), IEC 62443/C2M2 Specialist (5), Training Specialist (5).</w:t>
+        <w:t xml:space="preserve">Abatis: 200 man-days — Team Leader (60), Senior OT/ICS Specialist (60), Governance Specialist (40), IEC 62443/C2M2 Specialist (20), Training Specialist (20).</w:t>
       </w:r>
     </w:p>
     <w:p>
@@ -2578,7 +2578,7 @@
           <w:sz w:val="22"/>
           <w:szCs w:val="22"/>
         </w:rPr>
-        <w:t xml:space="preserve">EML: 145 man-days — DPM Power Systems/SCADA Engineer (50), Electrical Engineer (25), Stakeholder Engagement (15), QA/QC (10), Report Coordinator (15), Project Administrator (30).</w:t>
+        <w:t xml:space="preserve">EML: 220 man-days — DPM Power Systems/SCADA Engineer (100), Electrical Engineer (50), Stakeholder Engagement (15), QA/QC (10), Report Coordinator (15), Project Administrator (30).</w:t>
       </w:r>
     </w:p>
     <w:p>
@@ -2750,7 +2750,7 @@
                 <w:sz w:val="21"/>
                 <w:szCs w:val="21"/>
               </w:rPr>
-              <w:t xml:space="preserve">162,350.00</w:t>
+              <w:t xml:space="preserve">267,425.00</w:t>
             </w:r>
           </w:p>
         </w:tc>
@@ -2783,7 +2783,7 @@
                 <w:sz w:val="21"/>
                 <w:szCs w:val="21"/>
               </w:rPr>
-              <w:t xml:space="preserve">Profit @ 15%</w:t>
+              <w:t xml:space="preserve">Profit</w:t>
             </w:r>
           </w:p>
         </w:tc>
@@ -2814,7 +2814,7 @@
                 <w:sz w:val="21"/>
                 <w:szCs w:val="21"/>
               </w:rPr>
-              <w:t xml:space="preserve">30,440.63</w:t>
+              <w:t xml:space="preserve">80,227.50</w:t>
             </w:r>
           </w:p>
         </w:tc>
@@ -2878,7 +2878,7 @@
                 <w:sz w:val="21"/>
                 <w:szCs w:val="21"/>
               </w:rPr>
-              <w:t xml:space="preserve">192,790.63</w:t>
+              <w:t xml:space="preserve">347,652.50</w:t>
             </w:r>
           </w:p>
         </w:tc>
@@ -2942,7 +2942,7 @@
                 <w:sz w:val="21"/>
                 <w:szCs w:val="21"/>
               </w:rPr>
-              <w:t xml:space="preserve">34,702.31</w:t>
+              <w:t xml:space="preserve">[TBC]</w:t>
             </w:r>
           </w:p>
         </w:tc>
@@ -2975,7 +2975,7 @@
                 <w:sz w:val="21"/>
                 <w:szCs w:val="21"/>
               </w:rPr>
-              <w:t xml:space="preserve">SSCL @ 2.5%</w:t>
+              <w:t xml:space="preserve">SSCL</w:t>
             </w:r>
           </w:p>
         </w:tc>
@@ -3006,7 +3006,7 @@
                 <w:sz w:val="21"/>
                 <w:szCs w:val="21"/>
               </w:rPr>
-              <w:t xml:space="preserve">5,687.32</w:t>
+              <w:t xml:space="preserve">6,953.05</w:t>
             </w:r>
           </w:p>
         </w:tc>
@@ -3039,7 +3039,7 @@
                 <w:sz w:val="21"/>
                 <w:szCs w:val="21"/>
               </w:rPr>
-              <w:t xml:space="preserve">Grand Total (incl. VAT + SSCL)</w:t>
+              <w:t xml:space="preserve">Grand Total</w:t>
             </w:r>
           </w:p>
         </w:tc>
@@ -3070,7 +3070,7 @@
                 <w:sz w:val="21"/>
                 <w:szCs w:val="21"/>
               </w:rPr>
-              <w:t xml:space="preserve">233,180.26</w:t>
+              <w:t xml:space="preserve">354,605.55</w:t>
             </w:r>
           </w:p>
         </w:tc>
@@ -3091,7 +3091,7 @@
           <w:sz w:val="22"/>
           <w:szCs w:val="22"/>
         </w:rPr>
-        <w:t xml:space="preserve">[Currency and tax treatment for the financial forms — TBC]</w:t>
+        <w:t xml:space="preserve">Figures mirror the master response workbook ('Financial Summary' sheet, 29 Jul 2026 revision). [Currency, VAT applicability and tax treatment for the financial forms — TBC]</w:t>
       </w:r>
     </w:p>
     <w:tbl>

</xml_diff>

<commit_message>
Merge V0.3 proposal content into branded technical proposal
- Understanding of the Project & Objectives section (Tasks 1-4: maturity
  assessment, Point Zero baseline & Evidence Ledger, governance/audit
  framework with RACI and KPIs, capacity building for NSO/TNO/PUCSL)
- In-scope facilities: NSCC, Lakvijaya, Victoria, Kotmale, Biyagama,
  telecom hubs, IT/OT interfaces
- Explicit exclusions and non-disruption guarantees (no VAPT, no control
  deployment, safety assurance)
- RTI Act 2016 s.5(d) confidentiality statement, 60-day validity,
  ISO 31000, DNP3/IEC 61850 references, operational toolkits

Co-Authored-By: Claude Fable 5 <noreply@anthropic.com>
Claude-Session: https://claude.ai/code/session_015ypYFL7E2g6EXFAxcDeuoe
</commit_message>
<xml_diff>
--- a/PUCSL_Technical_Proposal_Draft.docx
+++ b/PUCSL_Technical_Proposal_Draft.docx
@@ -147,7 +147,7 @@
     </w:p>
     <w:p>
       <w:pPr>
-        <w:spacing w:before="0" w:after="0"/>
+        <w:spacing w:before="0" w:after="120"/>
       </w:pPr>
       <w:r>
         <w:rPr>
@@ -157,6 +157,21 @@
           <w:szCs w:val="18"/>
         </w:rPr>
         <w:t xml:space="preserve">© Platinum High Integrity Technologies Limited 2026</w:t>
+      </w:r>
+    </w:p>
+    <w:p>
+      <w:pPr>
+        <w:spacing w:before="0" w:after="0"/>
+      </w:pPr>
+      <w:r>
+        <w:rPr>
+          <w:rFonts w:ascii="Times New Roman" w:hAnsi="Times New Roman" w:cs="Times New Roman"/>
+          <w:i/>
+          <w:color w:val="7F7F7F"/>
+          <w:sz w:val="18"/>
+          <w:szCs w:val="18"/>
+        </w:rPr>
+        <w:t xml:space="preserve">Confidentiality: all information in this proposal is provided in confidence and is commercially sensitive. It contains proprietary trade secrets, pricing and know-how of the Joint Venture partners and is accordingly exempt from disclosure under the Right to Information Act, No. 12 of 2016 of Sri Lanka (Section 5(d)).</w:t>
       </w:r>
     </w:p>
     <w:p>
@@ -263,7 +278,7 @@
           <w:sz w:val="22"/>
           <w:szCs w:val="22"/>
         </w:rPr>
-        <w:t xml:space="preserve">We confirm that our proposal remains valid for the period stated in the RFP [TBC], that the information provided is true and correct, and that both Joint Venture partners accept joint responsibility for the performance of the assignment.</w:t>
+        <w:t xml:space="preserve">We confirm that our proposal remains valid for 60 calendar days from the closing date of the proposal submission as per RFP stipulations, that the information provided is true and correct, and that both Joint Venture partners accept joint responsibility for the performance of the assignment.</w:t>
       </w:r>
     </w:p>
     <w:p>
@@ -1114,6 +1129,103 @@
       <w:pPr>
         <w:spacing w:after="80"/>
       </w:pPr>
+    </w:p>
+    <w:p>
+      <w:pPr>
+        <w:keepNext/>
+        <w:spacing w:before="160" w:after="80"/>
+      </w:pPr>
+      <w:r>
+        <w:rPr>
+          <w:rFonts w:ascii="Arial" w:hAnsi="Arial" w:cs="Arial"/>
+          <w:b/>
+          <w:color w:val="3494BA"/>
+          <w:sz w:val="22"/>
+          <w:szCs w:val="22"/>
+        </w:rPr>
+        <w:t xml:space="preserve">3.0  Understanding of the Project and Objectives</w:t>
+      </w:r>
+    </w:p>
+    <w:p>
+      <w:pPr>
+        <w:spacing w:before="0" w:after="120"/>
+      </w:pPr>
+      <w:r>
+        <w:rPr>
+          <w:rFonts w:ascii="Times New Roman" w:hAnsi="Times New Roman" w:cs="Times New Roman"/>
+          <w:sz w:val="22"/>
+          <w:szCs w:val="22"/>
+        </w:rPr>
+        <w:t xml:space="preserve">Sri Lanka's national transmission grid and power generation infrastructure depend on tightly integrated Operational Technology (OT) and Information Technology (IT) systems — SCADA, Energy Management Systems (EMS), substation automation and specialised industrial communication protocols (e.g., DNP3, IEC 61850). PUCSL, as the statutory regulator of the electricity industry, requires both an evidence-based view of the sector's current cybersecurity readiness and a durable regulatory instrument — an audit framework — to sustain oversight. Our engagement is structured around four tasks:</w:t>
+      </w:r>
+    </w:p>
+    <w:p>
+      <w:pPr>
+        <w:numPr>
+          <w:ilvl w:val="0"/>
+          <w:numId w:val="1"/>
+        </w:numPr>
+        <w:spacing w:before="0" w:after="60"/>
+      </w:pPr>
+      <w:r>
+        <w:rPr>
+          <w:rFonts w:ascii="Times New Roman" w:hAnsi="Times New Roman" w:cs="Times New Roman"/>
+          <w:sz w:val="22"/>
+          <w:szCs w:val="22"/>
+        </w:rPr>
+        <w:t xml:space="preserve">Task 1 — Cybersecurity Maturity Assessment &amp; Gap Analysis: evaluate current cyber maturity across all 10 C2M2 v2.1 domains, analyse macro-level technical risks within grid operations (SCADA/EMS, network protocols), and benchmark findings against ISO/IEC 27001, IEC 62443 and NIST CSF.</w:t>
+      </w:r>
+    </w:p>
+    <w:p>
+      <w:pPr>
+        <w:numPr>
+          <w:ilvl w:val="0"/>
+          <w:numId w:val="1"/>
+        </w:numPr>
+        <w:spacing w:before="0" w:after="60"/>
+      </w:pPr>
+      <w:r>
+        <w:rPr>
+          <w:rFonts w:ascii="Times New Roman" w:hAnsi="Times New Roman" w:cs="Times New Roman"/>
+          <w:sz w:val="22"/>
+          <w:szCs w:val="22"/>
+        </w:rPr>
+        <w:t xml:space="preserve">Task 2 — Maturity Baseline &amp; Remediation Roadmap: establish a quantitative 'Point Zero' maturity profile (MIL scores), compile a defensible Evidence Ledger, and formulate a prioritised, cost-aware remediation roadmap.</w:t>
+      </w:r>
+    </w:p>
+    <w:p>
+      <w:pPr>
+        <w:numPr>
+          <w:ilvl w:val="0"/>
+          <w:numId w:val="1"/>
+        </w:numPr>
+        <w:spacing w:before="0" w:after="60"/>
+      </w:pPr>
+      <w:r>
+        <w:rPr>
+          <w:rFonts w:ascii="Times New Roman" w:hAnsi="Times New Roman" w:cs="Times New Roman"/>
+          <w:sz w:val="22"/>
+          <w:szCs w:val="22"/>
+        </w:rPr>
+        <w:t xml:space="preserve">Task 3 — Cybersecurity Governance &amp; Audit Framework: define target MILs across asset classes, author a tailored compliance framework and audit &amp; verification system (with RACI matrices and standardised audit checklists), and establish a benchmarking methodology with defined KPIs.</w:t>
+      </w:r>
+    </w:p>
+    <w:p>
+      <w:pPr>
+        <w:numPr>
+          <w:ilvl w:val="0"/>
+          <w:numId w:val="1"/>
+        </w:numPr>
+        <w:spacing w:before="0" w:after="60"/>
+      </w:pPr>
+      <w:r>
+        <w:rPr>
+          <w:rFonts w:ascii="Times New Roman" w:hAnsi="Times New Roman" w:cs="Times New Roman"/>
+          <w:sz w:val="22"/>
+          <w:szCs w:val="22"/>
+        </w:rPr>
+        <w:t xml:space="preserve">Task 4 — Institutional Capacity Building &amp; Operational Readiness: equip the National System Operator (NSO), the Transmission Network Operator and PUCSL with practical operational toolkits (risk registers, incident-response templates, monitoring dashboards), SOPs, regulatory compliance guides and hands-on workshops for technical and executive leadership.</w:t>
+      </w:r>
     </w:p>
     <w:p>
       <w:pPr>
@@ -1683,7 +1795,222 @@
           <w:sz w:val="22"/>
           <w:szCs w:val="22"/>
         </w:rPr>
-        <w:t xml:space="preserve">C2M2 was developed by the U.S. Department of Energy specifically for the energy sector, covers both IT and OT, is free to adopt and re-run (supporting PUCSL's ongoing regulatory monitoring), and maps cleanly to NIST CSF and IEC 62443 — allowing one assessment effort to serve maturity measurement, gap analysis and audit-framework design simultaneously.</w:t>
+        <w:t xml:space="preserve">C2M2 was developed by the U.S. Department of Energy specifically for the energy sector, covers both IT and OT, is free to adopt and re-run (supporting PUCSL's ongoing regulatory monitoring), and maps cleanly to NIST CSF and IEC 62443 — allowing one assessment effort to serve maturity measurement, gap analysis and audit-framework design simultaneously. Risk management activities are conducted in conformance with ISO 31000:2018.</w:t>
+      </w:r>
+    </w:p>
+    <w:p>
+      <w:pPr>
+        <w:keepNext/>
+        <w:spacing w:before="160" w:after="80"/>
+      </w:pPr>
+      <w:r>
+        <w:rPr>
+          <w:rFonts w:ascii="Arial" w:hAnsi="Arial" w:cs="Arial"/>
+          <w:b/>
+          <w:color w:val="3494BA"/>
+          <w:sz w:val="22"/>
+          <w:szCs w:val="22"/>
+        </w:rPr>
+        <w:t xml:space="preserve">3.4  In-Scope Infrastructure and Locations</w:t>
+      </w:r>
+    </w:p>
+    <w:p>
+      <w:pPr>
+        <w:spacing w:before="0" w:after="120"/>
+      </w:pPr>
+      <w:r>
+        <w:rPr>
+          <w:rFonts w:ascii="Times New Roman" w:hAnsi="Times New Roman" w:cs="Times New Roman"/>
+          <w:sz w:val="22"/>
+          <w:szCs w:val="22"/>
+        </w:rPr>
+        <w:t xml:space="preserve">The assessment encompasses macro-level architectural, procedural and governance assessment across critical operational and generation infrastructure, including: [confirm against official TOR]</w:t>
+      </w:r>
+    </w:p>
+    <w:p>
+      <w:pPr>
+        <w:numPr>
+          <w:ilvl w:val="0"/>
+          <w:numId w:val="1"/>
+        </w:numPr>
+        <w:spacing w:before="0" w:after="60"/>
+      </w:pPr>
+      <w:r>
+        <w:rPr>
+          <w:rFonts w:ascii="Times New Roman" w:hAnsi="Times New Roman" w:cs="Times New Roman"/>
+          <w:sz w:val="22"/>
+          <w:szCs w:val="22"/>
+        </w:rPr>
+        <w:t xml:space="preserve">National System Control Centre (NSCC);</w:t>
+      </w:r>
+    </w:p>
+    <w:p>
+      <w:pPr>
+        <w:numPr>
+          <w:ilvl w:val="0"/>
+          <w:numId w:val="1"/>
+        </w:numPr>
+        <w:spacing w:before="0" w:after="60"/>
+      </w:pPr>
+      <w:r>
+        <w:rPr>
+          <w:rFonts w:ascii="Times New Roman" w:hAnsi="Times New Roman" w:cs="Times New Roman"/>
+          <w:sz w:val="22"/>
+          <w:szCs w:val="22"/>
+        </w:rPr>
+        <w:t xml:space="preserve">Lakvijaya Power Station (thermal generation);</w:t>
+      </w:r>
+    </w:p>
+    <w:p>
+      <w:pPr>
+        <w:numPr>
+          <w:ilvl w:val="0"/>
+          <w:numId w:val="1"/>
+        </w:numPr>
+        <w:spacing w:before="0" w:after="60"/>
+      </w:pPr>
+      <w:r>
+        <w:rPr>
+          <w:rFonts w:ascii="Times New Roman" w:hAnsi="Times New Roman" w:cs="Times New Roman"/>
+          <w:sz w:val="22"/>
+          <w:szCs w:val="22"/>
+        </w:rPr>
+        <w:t xml:space="preserve">Victoria Power Station (hydro generation);</w:t>
+      </w:r>
+    </w:p>
+    <w:p>
+      <w:pPr>
+        <w:numPr>
+          <w:ilvl w:val="0"/>
+          <w:numId w:val="1"/>
+        </w:numPr>
+        <w:spacing w:before="0" w:after="60"/>
+      </w:pPr>
+      <w:r>
+        <w:rPr>
+          <w:rFonts w:ascii="Times New Roman" w:hAnsi="Times New Roman" w:cs="Times New Roman"/>
+          <w:sz w:val="22"/>
+          <w:szCs w:val="22"/>
+        </w:rPr>
+        <w:t xml:space="preserve">Kotmale Power Station (hydro generation);</w:t>
+      </w:r>
+    </w:p>
+    <w:p>
+      <w:pPr>
+        <w:numPr>
+          <w:ilvl w:val="0"/>
+          <w:numId w:val="1"/>
+        </w:numPr>
+        <w:spacing w:before="0" w:after="60"/>
+      </w:pPr>
+      <w:r>
+        <w:rPr>
+          <w:rFonts w:ascii="Times New Roman" w:hAnsi="Times New Roman" w:cs="Times New Roman"/>
+          <w:sz w:val="22"/>
+          <w:szCs w:val="22"/>
+        </w:rPr>
+        <w:t xml:space="preserve">Biyagama Grid Substation;</w:t>
+      </w:r>
+    </w:p>
+    <w:p>
+      <w:pPr>
+        <w:numPr>
+          <w:ilvl w:val="0"/>
+          <w:numId w:val="1"/>
+        </w:numPr>
+        <w:spacing w:before="0" w:after="60"/>
+      </w:pPr>
+      <w:r>
+        <w:rPr>
+          <w:rFonts w:ascii="Times New Roman" w:hAnsi="Times New Roman" w:cs="Times New Roman"/>
+          <w:sz w:val="22"/>
+          <w:szCs w:val="22"/>
+        </w:rPr>
+        <w:t xml:space="preserve">selected telecommunication and data network hubs supporting power grid communications;</w:t>
+      </w:r>
+    </w:p>
+    <w:p>
+      <w:pPr>
+        <w:numPr>
+          <w:ilvl w:val="0"/>
+          <w:numId w:val="1"/>
+        </w:numPr>
+        <w:spacing w:before="0" w:after="60"/>
+      </w:pPr>
+      <w:r>
+        <w:rPr>
+          <w:rFonts w:ascii="Times New Roman" w:hAnsi="Times New Roman" w:cs="Times New Roman"/>
+          <w:sz w:val="22"/>
+          <w:szCs w:val="22"/>
+        </w:rPr>
+        <w:t xml:space="preserve">IT/OT data interfaces and protocol flows between the National System Operator (NSO), the National Transmission Network Service Provider and grid-connected generation plants.</w:t>
+      </w:r>
+    </w:p>
+    <w:p>
+      <w:pPr>
+        <w:keepNext/>
+        <w:spacing w:before="160" w:after="80"/>
+      </w:pPr>
+      <w:r>
+        <w:rPr>
+          <w:rFonts w:ascii="Arial" w:hAnsi="Arial" w:cs="Arial"/>
+          <w:b/>
+          <w:color w:val="3494BA"/>
+          <w:sz w:val="22"/>
+          <w:szCs w:val="22"/>
+        </w:rPr>
+        <w:t xml:space="preserve">3.5  Explicit Exclusions and Non-Disruption Guarantees</w:t>
+      </w:r>
+    </w:p>
+    <w:p>
+      <w:pPr>
+        <w:numPr>
+          <w:ilvl w:val="0"/>
+          <w:numId w:val="1"/>
+        </w:numPr>
+        <w:spacing w:before="0" w:after="60"/>
+      </w:pPr>
+      <w:r>
+        <w:rPr>
+          <w:rFonts w:ascii="Times New Roman" w:hAnsi="Times New Roman" w:cs="Times New Roman"/>
+          <w:sz w:val="22"/>
+          <w:szCs w:val="22"/>
+        </w:rPr>
+        <w:t xml:space="preserve">No active or intrusive Vulnerability Assessment / Penetration Testing (VAPT): to guarantee zero operational disruption to live generation and transmission systems, the assessment is strictly limited to capability-maturity evaluation (C2M2), architectural analysis, configuration reviews and policy auditing. Active exploits, invasive network scanning and live system stress testing are explicitly excluded.</w:t>
+      </w:r>
+    </w:p>
+    <w:p>
+      <w:pPr>
+        <w:numPr>
+          <w:ilvl w:val="0"/>
+          <w:numId w:val="1"/>
+        </w:numPr>
+        <w:spacing w:before="0" w:after="60"/>
+      </w:pPr>
+      <w:r>
+        <w:rPr>
+          <w:rFonts w:ascii="Times New Roman" w:hAnsi="Times New Roman" w:cs="Times New Roman"/>
+          <w:sz w:val="22"/>
+          <w:szCs w:val="22"/>
+        </w:rPr>
+        <w:t xml:space="preserve">No direct deployment of security controls: implementation of physical or technical controls, live-environment reconfigurations or hardware modifications are excluded from this advisory phase.</w:t>
+      </w:r>
+    </w:p>
+    <w:p>
+      <w:pPr>
+        <w:numPr>
+          <w:ilvl w:val="0"/>
+          <w:numId w:val="1"/>
+        </w:numPr>
+        <w:spacing w:before="0" w:after="60"/>
+      </w:pPr>
+      <w:r>
+        <w:rPr>
+          <w:rFonts w:ascii="Times New Roman" w:hAnsi="Times New Roman" w:cs="Times New Roman"/>
+          <w:sz w:val="22"/>
+          <w:szCs w:val="22"/>
+        </w:rPr>
+        <w:t xml:space="preserve">Safety and operational assurance: all assessment activities are conducted in strict compliance with site protocols and with prior written approval from PUCSL and the system operators.</w:t>
       </w:r>
     </w:p>
     <w:tbl>
@@ -1853,6 +2180,40 @@
     </w:p>
     <w:p>
       <w:pPr>
+        <w:numPr>
+          <w:ilvl w:val="0"/>
+          <w:numId w:val="1"/>
+        </w:numPr>
+        <w:spacing w:before="0" w:after="60"/>
+      </w:pPr>
+      <w:r>
+        <w:rPr>
+          <w:rFonts w:ascii="Times New Roman" w:hAnsi="Times New Roman" w:cs="Times New Roman"/>
+          <w:sz w:val="22"/>
+          <w:szCs w:val="22"/>
+        </w:rPr>
+        <w:t xml:space="preserve">RACI matrices and standardised audit checklists for every audit procedure, with target maturity indicator levels (MILs) defined per asset class.</w:t>
+      </w:r>
+    </w:p>
+    <w:p>
+      <w:pPr>
+        <w:numPr>
+          <w:ilvl w:val="0"/>
+          <w:numId w:val="1"/>
+        </w:numPr>
+        <w:spacing w:before="0" w:after="60"/>
+      </w:pPr>
+      <w:r>
+        <w:rPr>
+          <w:rFonts w:ascii="Times New Roman" w:hAnsi="Times New Roman" w:cs="Times New Roman"/>
+          <w:sz w:val="22"/>
+          <w:szCs w:val="22"/>
+        </w:rPr>
+        <w:t xml:space="preserve">Benchmarking methodology with defined KPIs, enabling PUCSL to track sector-wide capability maturity over successive audit cycles.</w:t>
+      </w:r>
+    </w:p>
+    <w:p>
+      <w:pPr>
         <w:keepNext/>
         <w:spacing w:before="160" w:after="80"/>
       </w:pPr>
@@ -1940,7 +2301,7 @@
           <w:sz w:val="22"/>
           <w:szCs w:val="22"/>
         </w:rPr>
-        <w:t xml:space="preserve">Four workshops (local delivery by EML, content by Abatis). All training materials are handed over for PUCSL's continued use.</w:t>
+        <w:t xml:space="preserve">Four workshops (local delivery by EML, content by Abatis). All training materials are handed over for PUCSL's continued use. Alongside the workshops, we deliver practical operational toolkits to the NSO, the Transmission Network Operator and PUCSL: risk registers, incident-response templates, monitoring dashboards, SOPs and regulatory compliance guides.</w:t>
       </w:r>
     </w:p>
     <w:tbl>

</xml_diff>

<commit_message>
Reword CVE acronym to plain language across proposal and workbook
Replace 'zero CVEs' phrasing with 'zero publicly registered security
vulnerabilities' to avoid confusion with CVs (curricula vitae) while
preserving the zero-breach / zero-vulnerability differentiator claim

Co-Authored-By: Claude Fable 5 <noreply@anthropic.com>
Claude-Session: https://claude.ai/code/session_015ypYFL7E2g6EXFAxcDeuoe
</commit_message>
<xml_diff>
--- a/PUCSL_Technical_Proposal_Draft.docx
+++ b/PUCSL_Technical_Proposal_Draft.docx
@@ -391,7 +391,7 @@
           <w:sz w:val="22"/>
           <w:szCs w:val="22"/>
         </w:rPr>
-        <w:t xml:space="preserve">Over 20+ years of operation there has been no reported breach against the Abatis code and no CVE (Common Vulnerabilities and Exposures) registered against it — a record we believe is unique in the security industry.</w:t>
+        <w:t xml:space="preserve">Over 20+ years of operation there has been no reported breach against the Abatis code and no publicly registered security vulnerability recorded against it — a record we believe is unique in the security industry.</w:t>
       </w:r>
     </w:p>
     <w:p>
@@ -2825,7 +2825,7 @@
           <w:sz w:val="22"/>
           <w:szCs w:val="22"/>
         </w:rPr>
-        <w:t xml:space="preserve">Practical protective capability: uniquely among consultancies, the technical partner also builds protective technology with a 20-year zero-breach, zero-CVE record — assessment recommendations are grounded in what demonstrably works in live CNI environments.</w:t>
+        <w:t xml:space="preserve">Practical protective capability: uniquely among consultancies, the technical partner also builds protective technology with a 20-year record of zero breaches and zero registered vulnerabilities — assessment recommendations are grounded in what demonstrably works in live CNI environments.</w:t>
       </w:r>
     </w:p>
     <w:p>

</xml_diff>